<commit_message>
feat(statuts_sas): migration DOC-015 vers token-replacement sur modele Albane
- statuts_sas: ~1100 lignes de prose juridique en dur -> token-replacement
  lisant STATUTS_SAS_SPFPL_medecins_modele.docx (-625 lignes); validation
  metier (actionnaire unique, coherence capital, phrase matrimoniale) conservee
- prose byte-identique a la sortie validee (gate Akainu); espaces (NBSP/tabs)
  normalises; gras/souligne suit le modele d'Albane (3 intitules regagnent
  l'emphase que le from-scratch avait perdue = plus fidele au document source)
- fix 2 defauts d'authoring du modele: ligne 93 collage nom/montant; ARTICLE 23
  souligne (etait le seul article principal non souligne)
- fix test_mois_tables perime (autorisation_domiciliation n'utilise plus
  FRENCH_MONTHS depuis la propagation des dates JJ/MM/AAAA)
- doc: MIGRATION_TOKEN_REPLACEMENT_BACKLOG (backlog tenu ~21, premisse inversee)

Suite: 796 tests unitaires verts.

Co-Authored-By: Claude Opus 4.8 (1M context) <noreply@anthropic.com>
</commit_message>
<xml_diff>
--- a/project/source_documents/lot_04/STATUTS_SAS_SPFPL_medecins_modele.docx
+++ b/project/source_documents/lot_04/STATUTS_SAS_SPFPL_medecins_modele.docx
@@ -1722,7 +1722,7 @@
           <w:vertAlign w:val="baseline"/>
           <w:rtl w:val="0"/>
         </w:rPr>
-        <w:t xml:space="preserve">Par le Docteur [prenom] [nom][capital_social]</w:t>
+        <w:t>Par le Docteur [prenom] [nom]</w:t>
         <w:tab/>
         <w:tab/>
         <w:tab/>
@@ -1730,6 +1730,7 @@
         <w:tab/>
         <w:tab/>
         <w:tab/>
+        <w:t>[capital_social]</w:t>
       </w:r>
     </w:p>
     <w:p>
@@ -7597,6 +7598,7 @@
           <w:bCs w:val="1"/>
           <w:sz w:val="20"/>
           <w:szCs w:val="20"/>
+          <w:u w:val="single"/>
           <w:vertAlign w:val="baseline"/>
           <w:rtl w:val="0"/>
         </w:rPr>

</xml_diff>